<commit_message>
Update repository links in revision documents
</commit_message>
<xml_diff>
--- a/deliverables/track_manus_r3.docx
+++ b/deliverables/track_manus_r3.docx
@@ -375,7 +375,7 @@
         <w:spacing w:after="120" w:line="360" w:lineRule="auto"/>
         <w:jc w:val="both"/>
       </w:pPr>
-      <w:del w:id="78" w:author="Authors" w:date="2026-07-17T12:35:55Z">
+      <w:del w:id="78" w:author="Authors" w:date="2026-07-17T12:55:02Z">
         <w:r>
           <w:rPr>
             <w:rFonts w:eastAsia="Cambria"/>
@@ -385,7 +385,7 @@
           <w:delText>Background. Post-fracture rehabilitation is a prolonged, individualized process that requires ongoing adjustment of exercise regimens, pain monitoring, and functional goal-setting. Existing digital health tools predominantly deliver static, non-adaptive protocols that do not account for patient-specific recovery trajectories, fracture-type heterogeneity, or emerging complication signals. Large language model (LLM)–based intelligent agents — which couple natural-language reasoning with structured tool use — are a natural fit for this dynamic, longitudinal setting, yet their application to musculoskeletal rehabilitation has not been systematically explored.</w:delText>
         </w:r>
       </w:del>
-      <w:ins w:id="79" w:author="Authors" w:date="2026-07-17T12:35:55Z">
+      <w:ins w:id="79" w:author="Authors" w:date="2026-07-17T12:55:02Z">
         <w:r>
           <w:rPr>
             <w:rFonts w:eastAsia="Cambria"/>
@@ -401,7 +401,7 @@
         <w:spacing w:after="120" w:line="360" w:lineRule="auto"/>
         <w:jc w:val="both"/>
       </w:pPr>
-      <w:del w:id="80" w:author="Authors" w:date="2026-07-17T12:35:55Z">
+      <w:del w:id="80" w:author="Authors" w:date="2026-07-17T12:55:02Z">
         <w:r>
           <w:rPr>
             <w:rFonts w:eastAsia="Cambria"/>
@@ -417,7 +417,7 @@
         <w:spacing w:after="120" w:line="360" w:lineRule="auto"/>
         <w:jc w:val="both"/>
       </w:pPr>
-      <w:del w:id="81" w:author="Authors" w:date="2026-07-17T12:35:55Z">
+      <w:del w:id="81" w:author="Authors" w:date="2026-07-17T12:55:02Z">
         <w:r>
           <w:rPr>
             <w:rFonts w:eastAsia="Cambria"/>
@@ -433,7 +433,7 @@
         <w:spacing w:after="120" w:line="360" w:lineRule="auto"/>
         <w:jc w:val="both"/>
       </w:pPr>
-      <w:del w:id="82" w:author="Authors" w:date="2026-07-17T12:35:55Z">
+      <w:del w:id="82" w:author="Authors" w:date="2026-07-17T12:55:02Z">
         <w:r>
           <w:rPr>
             <w:rFonts w:eastAsia="Cambria"/>
@@ -10741,7 +10741,7 @@
         </w:numPr>
         <w:spacing w:after="80" w:line="360" w:lineRule="auto"/>
       </w:pPr>
-      <w:del w:id="83" w:author="Authors" w:date="2026-07-17T12:35:55Z">
+      <w:del w:id="83" w:author="Authors" w:date="2026-07-17T12:55:02Z">
         <w:r>
           <w:rPr>
             <w:rFonts w:eastAsia="Cambria"/>
@@ -10749,7 +10749,7 @@
           <w:delText>Single-GPU training recipe (§5): QLoRA fine-tuning that fits a 24 GB consumer GPU and runs in ~14 h on 2 × A100. The model weights and training code will be released openly.</w:delText>
         </w:r>
       </w:del>
-      <w:ins w:id="84" w:author="Authors" w:date="2026-07-17T12:35:55Z">
+      <w:ins w:id="84" w:author="Authors" w:date="2026-07-17T12:55:02Z">
         <w:r>
           <w:rPr>
             <w:rFonts w:eastAsia="Cambria"/>
@@ -10818,7 +10818,7 @@
       <w:pPr>
         <w:spacing w:after="120" w:line="360" w:lineRule="auto"/>
       </w:pPr>
-      <w:del w:id="85" w:author="Authors" w:date="2026-07-17T12:35:55Z">
+      <w:del w:id="85" w:author="Authors" w:date="2026-07-17T12:55:02Z">
         <w:r>
           <w:rPr>
             <w:rFonts w:eastAsia="Cambria"/>
@@ -10828,7 +10828,7 @@
           <w:delText xml:space="preserve">Availability of data and materials. All data sources used in this study are open-access and were last accessed in May 2026: AAOS Clinical Practice Guidelines (https://www.orthoguidelines.org/guidelines); AO Foundation Surgery Reference (https://surgeryreference.aofoundation.org/); PubMed Central Open Access Subset (https://catalog.data.gov/dataset/pubmed-central-open-access-subset-pmc-oa); PhysioNet (https://physionet.org/); and the WikiDoc (https://www.wikidoc.org/) and MedlinePlus (https://medlineplus.gov/) patient-education resources. No new primary patient data were generated for this study. </w:delText>
         </w:r>
       </w:del>
-      <w:ins w:id="86" w:author="Authors" w:date="2026-07-17T12:35:55Z">
+      <w:ins w:id="86" w:author="Authors" w:date="2026-07-17T12:55:02Z">
         <w:r>
           <w:rPr>
             <w:rFonts w:eastAsia="Cambria"/>
@@ -10843,14 +10843,14 @@
       <w:pPr>
         <w:spacing w:after="120" w:line="360" w:lineRule="auto"/>
       </w:pPr>
-      <w:ins w:id="87" w:author="Authors" w:date="2026-07-17T12:35:55Z">
+      <w:ins w:id="87" w:author="Authors" w:date="2026-07-17T12:55:02Z">
         <w:r>
           <w:rPr>
             <w:rFonts w:eastAsia="Cambria"/>
             <w:b/>
             <w:bCs/>
           </w:rPr>
-          <w:t>Code availability. The public repository at https://github.com/hangcao87/FractureAgent/tree/reproducible-rebuild contains the data-processing scripts, versioned training prompts, tool schemas and implementations, deterministic safety gate, ms-swift/Swift QLoRA configuration, training launchers, evaluation code and non-sensitive run-record templates. The trained FractureAgent weights, LoRA checkpoints, private credentials and curated training corpus are not publicly released at this stage. Users may reproduce the workflow with a legally obtained local base model and their own authorized data.</w:t>
+          <w:t>Code availability. The public repository at https://github.com/hangcao87/FractureAgent contains the data-processing scripts, versioned training prompts, tool schemas and implementations, deterministic safety gate, ms-swift/Swift QLoRA configuration, training launchers, evaluation code and non-sensitive run-record templates. The trained FractureAgent weights, LoRA checkpoints, private credentials and curated training corpus are not publicly released at this stage. Users may reproduce the workflow with a legally obtained local base model and their own authorized data.</w:t>
         </w:r>
       </w:ins>
     </w:p>

</xml_diff>

<commit_message>
Clarify abstract problem-method-results flow
</commit_message>
<xml_diff>
--- a/deliverables/track_manus_r3.docx
+++ b/deliverables/track_manus_r3.docx
@@ -375,7 +375,7 @@
         <w:spacing w:after="120" w:line="360" w:lineRule="auto"/>
         <w:jc w:val="both"/>
       </w:pPr>
-      <w:del w:id="78" w:author="Authors" w:date="2026-07-17T12:55:02Z">
+      <w:del w:id="78" w:author="Authors" w:date="2026-07-17T13:45:24Z">
         <w:r>
           <w:rPr>
             <w:rFonts w:eastAsia="Cambria"/>
@@ -385,14 +385,14 @@
           <w:delText>Background. Post-fracture rehabilitation is a prolonged, individualized process that requires ongoing adjustment of exercise regimens, pain monitoring, and functional goal-setting. Existing digital health tools predominantly deliver static, non-adaptive protocols that do not account for patient-specific recovery trajectories, fracture-type heterogeneity, or emerging complication signals. Large language model (LLM)–based intelligent agents — which couple natural-language reasoning with structured tool use — are a natural fit for this dynamic, longitudinal setting, yet their application to musculoskeletal rehabilitation has not been systematically explored.</w:delText>
         </w:r>
       </w:del>
-      <w:ins w:id="79" w:author="Authors" w:date="2026-07-17T12:55:02Z">
+      <w:ins w:id="79" w:author="Authors" w:date="2026-07-17T13:45:24Z">
         <w:r>
           <w:rPr>
             <w:rFonts w:eastAsia="Cambria"/>
             <w:b/>
             <w:bCs/>
           </w:rPr>
-          <w:t>Post-fracture rehabilitation is prolonged and individualized, yet many digital tools provide static guidance between clinic visits. We developed FractureAgent, a ReAct-style intelligent agent built on a domain-adapted Qwen3.5-9B backbone and equipped with five typed tools for exercise retrieval, pain assessment, functional-progress tracking, literature retrieval and reminder planning. The model was adapted with QLoRA supervised instruction tuning on 18,742 synthetic rehabilitation dialogues and tool-use traces constructed from open-access clinical and patient-education sources. We evaluated the agent using automated functional metrics, expert clinical ratings and 210 simulated-patient scenarios covering six fracture types and three rehabilitation phases. FractureAgent achieved a task completion rate of 91.4%, a mean expert clinical-appropriateness score of 4.21/5.00, pain-assessment concordance of 0.873, exercise-appropriateness of 0.896 and complication-detection sensitivity of 0.843. It outperformed the evaluated baselines, including the same unfine-tuned Qwen3.5-9B backbone. These findings support technical feasibility in simulated scenarios, but do not establish clinical effectiveness or readiness for deployment.</w:t>
+          <w:t>Post-fracture rehabilitation requires individualized, phase-specific guidance as pain, function and exercise tolerance change over time, but many digital tools provide static information between clinic visits and do not integrate symptom assessment, evidence retrieval and safety escalation. To address this gap, we developed FractureAgent, a ReAct-style intelligent agent that combines a domain-adapted Qwen3.5-9B backbone with five typed tools for exercise retrieval, pain assessment, functional-progress tracking, literature retrieval and reminder planning. We adapted the model with QLoRA supervised instruction tuning on 18,742 synthetic rehabilitation dialogues and tool-use traces derived from open-access clinical and patient-education sources. Across automated functional metrics, expert clinical ratings and 210 simulated-patient scenarios spanning six fracture types and three rehabilitation phases, FractureAgent achieved a task completion rate of 91.4%, a mean clinical-appropriateness score of 4.21/5.00, pain-assessment concordance of 0.873, exercise-appropriateness of 0.896 and complication-detection sensitivity of 0.843, outperforming the evaluated baselines including the unfine-tuned Qwen3.5-9B backbone. These results indicate that tool-augmented language-model agents can provide context-responsive fracture-rehabilitation support in simulated settings, but they do not establish clinical effectiveness or readiness for deployment.</w:t>
         </w:r>
       </w:ins>
     </w:p>
@@ -401,7 +401,7 @@
         <w:spacing w:after="120" w:line="360" w:lineRule="auto"/>
         <w:jc w:val="both"/>
       </w:pPr>
-      <w:del w:id="80" w:author="Authors" w:date="2026-07-17T12:55:02Z">
+      <w:del w:id="80" w:author="Authors" w:date="2026-07-17T13:45:24Z">
         <w:r>
           <w:rPr>
             <w:rFonts w:eastAsia="Cambria"/>
@@ -417,7 +417,7 @@
         <w:spacing w:after="120" w:line="360" w:lineRule="auto"/>
         <w:jc w:val="both"/>
       </w:pPr>
-      <w:del w:id="81" w:author="Authors" w:date="2026-07-17T12:55:02Z">
+      <w:del w:id="81" w:author="Authors" w:date="2026-07-17T13:45:24Z">
         <w:r>
           <w:rPr>
             <w:rFonts w:eastAsia="Cambria"/>
@@ -433,7 +433,7 @@
         <w:spacing w:after="120" w:line="360" w:lineRule="auto"/>
         <w:jc w:val="both"/>
       </w:pPr>
-      <w:del w:id="82" w:author="Authors" w:date="2026-07-17T12:55:02Z">
+      <w:del w:id="82" w:author="Authors" w:date="2026-07-17T13:45:24Z">
         <w:r>
           <w:rPr>
             <w:rFonts w:eastAsia="Cambria"/>
@@ -10741,7 +10741,7 @@
         </w:numPr>
         <w:spacing w:after="80" w:line="360" w:lineRule="auto"/>
       </w:pPr>
-      <w:del w:id="83" w:author="Authors" w:date="2026-07-17T12:55:02Z">
+      <w:del w:id="83" w:author="Authors" w:date="2026-07-17T13:45:24Z">
         <w:r>
           <w:rPr>
             <w:rFonts w:eastAsia="Cambria"/>
@@ -10749,7 +10749,7 @@
           <w:delText>Single-GPU training recipe (§5): QLoRA fine-tuning that fits a 24 GB consumer GPU and runs in ~14 h on 2 × A100. The model weights and training code will be released openly.</w:delText>
         </w:r>
       </w:del>
-      <w:ins w:id="84" w:author="Authors" w:date="2026-07-17T12:55:02Z">
+      <w:ins w:id="84" w:author="Authors" w:date="2026-07-17T13:45:24Z">
         <w:r>
           <w:rPr>
             <w:rFonts w:eastAsia="Cambria"/>
@@ -10818,7 +10818,7 @@
       <w:pPr>
         <w:spacing w:after="120" w:line="360" w:lineRule="auto"/>
       </w:pPr>
-      <w:del w:id="85" w:author="Authors" w:date="2026-07-17T12:55:02Z">
+      <w:del w:id="85" w:author="Authors" w:date="2026-07-17T13:45:24Z">
         <w:r>
           <w:rPr>
             <w:rFonts w:eastAsia="Cambria"/>
@@ -10828,7 +10828,7 @@
           <w:delText xml:space="preserve">Availability of data and materials. All data sources used in this study are open-access and were last accessed in May 2026: AAOS Clinical Practice Guidelines (https://www.orthoguidelines.org/guidelines); AO Foundation Surgery Reference (https://surgeryreference.aofoundation.org/); PubMed Central Open Access Subset (https://catalog.data.gov/dataset/pubmed-central-open-access-subset-pmc-oa); PhysioNet (https://physionet.org/); and the WikiDoc (https://www.wikidoc.org/) and MedlinePlus (https://medlineplus.gov/) patient-education resources. No new primary patient data were generated for this study. </w:delText>
         </w:r>
       </w:del>
-      <w:ins w:id="86" w:author="Authors" w:date="2026-07-17T12:55:02Z">
+      <w:ins w:id="86" w:author="Authors" w:date="2026-07-17T13:45:24Z">
         <w:r>
           <w:rPr>
             <w:rFonts w:eastAsia="Cambria"/>
@@ -10843,7 +10843,7 @@
       <w:pPr>
         <w:spacing w:after="120" w:line="360" w:lineRule="auto"/>
       </w:pPr>
-      <w:ins w:id="87" w:author="Authors" w:date="2026-07-17T12:55:02Z">
+      <w:ins w:id="87" w:author="Authors" w:date="2026-07-17T13:45:24Z">
         <w:r>
           <w:rPr>
             <w:rFonts w:eastAsia="Cambria"/>

</xml_diff>